<commit_message>
docs: maquettes HTML prototype + §7.1 dans le cahier des charges
</commit_message>
<xml_diff>
--- a/docs/cahier-des-charges.docx
+++ b/docs/cahier-des-charges.docx
@@ -4657,6 +4657,231 @@
     <w:p>
       <w:pPr>
         <w:pBdr>
+          <w:bottom w:val="single" w:sz="8" w:space="4" w:color="E2E8F0"/>
+        </w:pBdr>
+        <w:spacing w:before="200" w:after="100"/>
+      </w:pPr>
+      <w:r>
+        <w:rPr>
+          <w:rFonts w:ascii="Outfit" w:hAnsi="Outfit"/>
+          <w:b/>
+          <w:i w:val="0"/>
+          <w:color w:val="0A3D67"/>
+          <w:sz w:val="30"/>
+        </w:rPr>
+        <w:t>7.1 Maquettes</w:t>
+      </w:r>
+    </w:p>
+    <w:p>
+      <w:pPr>
+        <w:spacing w:before="0" w:after="80"/>
+      </w:pPr>
+      <w:r>
+        <w:rPr>
+          <w:rFonts w:ascii="Outfit" w:hAnsi="Outfit"/>
+          <w:b w:val="0"/>
+          <w:i w:val="0"/>
+          <w:color w:val="171717"/>
+          <w:sz w:val="22"/>
+        </w:rPr>
+        <w:t>Les maquettes haute fidélité sont disponibles sous forme de prototype HTML interactif (docs/maquettes.html — ouvrir dans un navigateur).</w:t>
+      </w:r>
+    </w:p>
+    <w:tbl>
+      <w:tblPr>
+        <w:tblStyle w:val="TableGrid"/>
+        <w:tblW w:type="auto" w:w="0"/>
+        <w:jc w:val="left"/>
+        <w:tblLook w:firstColumn="1" w:firstRow="1" w:lastColumn="0" w:lastRow="0" w:noHBand="0" w:noVBand="1" w:val="04A0"/>
+      </w:tblPr>
+      <w:tblGrid>
+        <w:gridCol w:w="4703"/>
+        <w:gridCol w:w="4703"/>
+      </w:tblGrid>
+      <w:tr>
+        <w:tc>
+          <w:tcPr>
+            <w:tcW w:type="dxa" w:w="3402"/>
+            <w:shd w:val="clear" w:color="auto" w:fill="F29400"/>
+            <w:vAlign w:val="center"/>
+          </w:tcPr>
+          <w:p>
+            <w:r>
+              <w:rPr>
+                <w:rFonts w:ascii="Outfit" w:hAnsi="Outfit"/>
+                <w:b/>
+                <w:i w:val="0"/>
+                <w:color w:val="FFFFFF"/>
+                <w:sz w:val="20"/>
+              </w:rPr>
+              <w:t>Écran</w:t>
+            </w:r>
+          </w:p>
+        </w:tc>
+        <w:tc>
+          <w:tcPr>
+            <w:tcW w:type="dxa" w:w="5669"/>
+            <w:shd w:val="clear" w:color="auto" w:fill="F29400"/>
+            <w:vAlign w:val="center"/>
+          </w:tcPr>
+          <w:p>
+            <w:r>
+              <w:rPr>
+                <w:rFonts w:ascii="Outfit" w:hAnsi="Outfit"/>
+                <w:b/>
+                <w:i w:val="0"/>
+                <w:color w:val="FFFFFF"/>
+                <w:sz w:val="20"/>
+              </w:rPr>
+              <w:t>Description</w:t>
+            </w:r>
+          </w:p>
+        </w:tc>
+      </w:tr>
+      <w:tr>
+        <w:tc>
+          <w:tcPr>
+            <w:tcW w:type="dxa" w:w="3402"/>
+            <w:shd w:val="clear" w:color="auto" w:fill="FFF8EC"/>
+            <w:vAlign w:val="center"/>
+          </w:tcPr>
+          <w:p>
+            <w:r>
+              <w:rPr>
+                <w:rFonts w:ascii="Outfit" w:hAnsi="Outfit"/>
+                <w:b/>
+                <w:i w:val="0"/>
+                <w:color w:val="0A3D67"/>
+                <w:sz w:val="20"/>
+              </w:rPr>
+              <w:t>Connexion</w:t>
+            </w:r>
+          </w:p>
+        </w:tc>
+        <w:tc>
+          <w:tcPr>
+            <w:tcW w:type="dxa" w:w="5669"/>
+            <w:shd w:val="clear" w:color="auto" w:fill="FFF8EC"/>
+            <w:vAlign w:val="center"/>
+          </w:tcPr>
+          <w:p>
+            <w:r>
+              <w:rPr>
+                <w:rFonts w:ascii="Outfit" w:hAnsi="Outfit"/>
+                <w:b w:val="0"/>
+                <w:i w:val="0"/>
+                <w:color w:val="171717"/>
+                <w:sz w:val="20"/>
+              </w:rPr>
+              <w:t>Formulaire email/mot de passe, fond blueprint</w:t>
+            </w:r>
+          </w:p>
+        </w:tc>
+      </w:tr>
+      <w:tr>
+        <w:tc>
+          <w:tcPr>
+            <w:tcW w:type="dxa" w:w="3402"/>
+            <w:shd w:val="clear" w:color="auto" w:fill="FFFFFF"/>
+            <w:vAlign w:val="center"/>
+          </w:tcPr>
+          <w:p>
+            <w:r>
+              <w:rPr>
+                <w:rFonts w:ascii="Outfit" w:hAnsi="Outfit"/>
+                <w:b/>
+                <w:i w:val="0"/>
+                <w:color w:val="0A3D67"/>
+                <w:sz w:val="20"/>
+              </w:rPr>
+              <w:t>Espace étudiant — Notes</w:t>
+            </w:r>
+          </w:p>
+        </w:tc>
+        <w:tc>
+          <w:tcPr>
+            <w:tcW w:type="dxa" w:w="5669"/>
+            <w:shd w:val="clear" w:color="auto" w:fill="FFFFFF"/>
+            <w:vAlign w:val="center"/>
+          </w:tcPr>
+          <w:p>
+            <w:r>
+              <w:rPr>
+                <w:rFonts w:ascii="Outfit" w:hAnsi="Outfit"/>
+                <w:b w:val="0"/>
+                <w:i w:val="0"/>
+                <w:color w:val="171717"/>
+                <w:sz w:val="20"/>
+              </w:rPr>
+              <w:t>Tableau de notes avec moyenne, sidebar de navigation</w:t>
+            </w:r>
+          </w:p>
+        </w:tc>
+      </w:tr>
+      <w:tr>
+        <w:tc>
+          <w:tcPr>
+            <w:tcW w:type="dxa" w:w="3402"/>
+            <w:shd w:val="clear" w:color="auto" w:fill="FFF8EC"/>
+            <w:vAlign w:val="center"/>
+          </w:tcPr>
+          <w:p>
+            <w:r>
+              <w:rPr>
+                <w:rFonts w:ascii="Outfit" w:hAnsi="Outfit"/>
+                <w:b/>
+                <w:i w:val="0"/>
+                <w:color w:val="0A3D67"/>
+                <w:sz w:val="20"/>
+              </w:rPr>
+              <w:t>Espace entreprise — Dépôt offre</w:t>
+            </w:r>
+          </w:p>
+        </w:tc>
+        <w:tc>
+          <w:tcPr>
+            <w:tcW w:type="dxa" w:w="5669"/>
+            <w:shd w:val="clear" w:color="auto" w:fill="FFF8EC"/>
+            <w:vAlign w:val="center"/>
+          </w:tcPr>
+          <w:p>
+            <w:r>
+              <w:rPr>
+                <w:rFonts w:ascii="Outfit" w:hAnsi="Outfit"/>
+                <w:b w:val="0"/>
+                <w:i w:val="0"/>
+                <w:color w:val="171717"/>
+                <w:sz w:val="20"/>
+              </w:rPr>
+              <w:t>Formulaire de création d'offre d'alternance</w:t>
+            </w:r>
+          </w:p>
+        </w:tc>
+      </w:tr>
+    </w:tbl>
+    <w:p>
+      <w:pPr>
+        <w:spacing w:before="0" w:after="100"/>
+      </w:pPr>
+    </w:p>
+    <w:p>
+      <w:pPr>
+        <w:spacing w:before="0" w:after="80"/>
+      </w:pPr>
+      <w:r>
+        <w:rPr>
+          <w:rFonts w:ascii="Outfit" w:hAnsi="Outfit"/>
+          <w:b w:val="0"/>
+          <w:i w:val="0"/>
+          <w:color w:val="171717"/>
+          <w:sz w:val="22"/>
+        </w:rPr>
+        <w:t>Les maquettes respectent la charte graphique (thème dark, #0A3D67 / #F29400) et servent de référence visuelle pour le développement des phases 2 à 5.</w:t>
+      </w:r>
+    </w:p>
+    <w:p>
+      <w:pPr>
+        <w:pBdr>
           <w:bottom w:val="single" w:sz="16" w:space="4" w:color="F29400"/>
         </w:pBdr>
         <w:spacing w:before="300" w:after="160"/>
@@ -6103,7 +6328,7 @@
                 <w:color w:val="171717"/>
                 <w:sz w:val="20"/>
               </w:rPr>
-              <w:t>Figma ou équivalent</w:t>
+              <w:t>HTML prototype (docs/maquettes.html)</w:t>
             </w:r>
           </w:p>
         </w:tc>
@@ -6122,7 +6347,7 @@
                 <w:color w:val="171717"/>
                 <w:sz w:val="20"/>
               </w:rPr>
-              <w:t>Avril 2026</w:t>
+              <w:t>Mars 2026 ✓</w:t>
             </w:r>
           </w:p>
         </w:tc>

</xml_diff>